<commit_message>
Modified the Project Description word document
</commit_message>
<xml_diff>
--- a/Documentation/Description.docx
+++ b/Documentation/Description.docx
@@ -2211,6 +2211,245 @@
           <w:szCs w:val="16"/>
         </w:rPr>
         <w:t xml:space="preserve"> repo.</w:t>
+      </w:r>
+    </w:p>
+    <w:p>
+      <w:pPr>
+        <w:pStyle w:val="ListParagraph"/>
+        <w:numPr>
+          <w:ilvl w:val="0"/>
+          <w:numId w:val="5"/>
+        </w:numPr>
+        <w:rPr>
+          <w:sz w:val="16"/>
+          <w:szCs w:val="16"/>
+        </w:rPr>
+      </w:pPr>
+      <w:r>
+        <w:rPr>
+          <w:sz w:val="16"/>
+          <w:szCs w:val="16"/>
+        </w:rPr>
+        <w:t>Git status: -</w:t>
+      </w:r>
+    </w:p>
+    <w:p>
+      <w:pPr>
+        <w:pStyle w:val="ListParagraph"/>
+        <w:numPr>
+          <w:ilvl w:val="1"/>
+          <w:numId w:val="5"/>
+        </w:numPr>
+        <w:rPr>
+          <w:sz w:val="16"/>
+          <w:szCs w:val="16"/>
+        </w:rPr>
+      </w:pPr>
+      <w:r>
+        <w:rPr>
+          <w:sz w:val="16"/>
+          <w:szCs w:val="16"/>
+        </w:rPr>
+        <w:t>To check the untracked files.</w:t>
+      </w:r>
+    </w:p>
+    <w:p>
+      <w:pPr>
+        <w:pStyle w:val="ListParagraph"/>
+        <w:numPr>
+          <w:ilvl w:val="0"/>
+          <w:numId w:val="5"/>
+        </w:numPr>
+        <w:rPr>
+          <w:sz w:val="16"/>
+          <w:szCs w:val="16"/>
+        </w:rPr>
+      </w:pPr>
+      <w:r>
+        <w:rPr>
+          <w:sz w:val="16"/>
+          <w:szCs w:val="16"/>
+        </w:rPr>
+        <w:t xml:space="preserve">Git </w:t>
+      </w:r>
+      <w:proofErr w:type="gramStart"/>
+      <w:r>
+        <w:rPr>
+          <w:sz w:val="16"/>
+          <w:szCs w:val="16"/>
+        </w:rPr>
+        <w:t>add .</w:t>
+      </w:r>
+      <w:proofErr w:type="gramEnd"/>
+      <w:r>
+        <w:rPr>
+          <w:sz w:val="16"/>
+          <w:szCs w:val="16"/>
+        </w:rPr>
+        <w:t>: -</w:t>
+      </w:r>
+    </w:p>
+    <w:p>
+      <w:pPr>
+        <w:pStyle w:val="ListParagraph"/>
+        <w:numPr>
+          <w:ilvl w:val="1"/>
+          <w:numId w:val="5"/>
+        </w:numPr>
+        <w:rPr>
+          <w:sz w:val="16"/>
+          <w:szCs w:val="16"/>
+        </w:rPr>
+      </w:pPr>
+      <w:r>
+        <w:rPr>
+          <w:sz w:val="16"/>
+          <w:szCs w:val="16"/>
+        </w:rPr>
+        <w:t>Add the files in staging area.</w:t>
+      </w:r>
+    </w:p>
+    <w:p>
+      <w:pPr>
+        <w:pStyle w:val="ListParagraph"/>
+        <w:numPr>
+          <w:ilvl w:val="0"/>
+          <w:numId w:val="5"/>
+        </w:numPr>
+        <w:rPr>
+          <w:sz w:val="16"/>
+          <w:szCs w:val="16"/>
+        </w:rPr>
+      </w:pPr>
+      <w:r>
+        <w:rPr>
+          <w:sz w:val="16"/>
+          <w:szCs w:val="16"/>
+        </w:rPr>
+        <w:t>Git commit -m “message”: -</w:t>
+      </w:r>
+    </w:p>
+    <w:p>
+      <w:pPr>
+        <w:pStyle w:val="ListParagraph"/>
+        <w:numPr>
+          <w:ilvl w:val="1"/>
+          <w:numId w:val="5"/>
+        </w:numPr>
+        <w:rPr>
+          <w:sz w:val="16"/>
+          <w:szCs w:val="16"/>
+        </w:rPr>
+      </w:pPr>
+      <w:r>
+        <w:rPr>
+          <w:sz w:val="16"/>
+          <w:szCs w:val="16"/>
+        </w:rPr>
+        <w:t>Commit the changes and give a meaningful message.</w:t>
+      </w:r>
+    </w:p>
+    <w:p>
+      <w:pPr>
+        <w:pStyle w:val="ListParagraph"/>
+        <w:numPr>
+          <w:ilvl w:val="0"/>
+          <w:numId w:val="5"/>
+        </w:numPr>
+        <w:rPr>
+          <w:sz w:val="16"/>
+          <w:szCs w:val="16"/>
+        </w:rPr>
+      </w:pPr>
+      <w:r>
+        <w:rPr>
+          <w:sz w:val="16"/>
+          <w:szCs w:val="16"/>
+        </w:rPr>
+        <w:t>git branch -M main</w:t>
+      </w:r>
+      <w:r>
+        <w:rPr>
+          <w:sz w:val="16"/>
+          <w:szCs w:val="16"/>
+        </w:rPr>
+        <w:t>: -</w:t>
+      </w:r>
+    </w:p>
+    <w:p>
+      <w:pPr>
+        <w:pStyle w:val="ListParagraph"/>
+        <w:numPr>
+          <w:ilvl w:val="1"/>
+          <w:numId w:val="5"/>
+        </w:numPr>
+        <w:rPr>
+          <w:sz w:val="16"/>
+          <w:szCs w:val="16"/>
+        </w:rPr>
+      </w:pPr>
+      <w:r>
+        <w:rPr>
+          <w:sz w:val="16"/>
+          <w:szCs w:val="16"/>
+        </w:rPr>
+        <w:t>switch to main branch</w:t>
+      </w:r>
+    </w:p>
+    <w:p>
+      <w:pPr>
+        <w:pStyle w:val="ListParagraph"/>
+        <w:numPr>
+          <w:ilvl w:val="0"/>
+          <w:numId w:val="5"/>
+        </w:numPr>
+        <w:rPr>
+          <w:sz w:val="16"/>
+          <w:szCs w:val="16"/>
+        </w:rPr>
+      </w:pPr>
+      <w:r>
+        <w:rPr>
+          <w:sz w:val="16"/>
+          <w:szCs w:val="16"/>
+        </w:rPr>
+        <w:t>git push -u origin main: -</w:t>
+      </w:r>
+    </w:p>
+    <w:p>
+      <w:pPr>
+        <w:pStyle w:val="ListParagraph"/>
+        <w:numPr>
+          <w:ilvl w:val="1"/>
+          <w:numId w:val="5"/>
+        </w:numPr>
+        <w:rPr>
+          <w:sz w:val="16"/>
+          <w:szCs w:val="16"/>
+        </w:rPr>
+      </w:pPr>
+      <w:r>
+        <w:rPr>
+          <w:sz w:val="16"/>
+          <w:szCs w:val="16"/>
+        </w:rPr>
+        <w:t xml:space="preserve">push the changes to the remote </w:t>
+      </w:r>
+      <w:proofErr w:type="spellStart"/>
+      <w:r>
+        <w:rPr>
+          <w:sz w:val="16"/>
+          <w:szCs w:val="16"/>
+        </w:rPr>
+        <w:t>github</w:t>
+      </w:r>
+      <w:proofErr w:type="spellEnd"/>
+      <w:r>
+        <w:rPr>
+          <w:sz w:val="16"/>
+          <w:szCs w:val="16"/>
+        </w:rPr>
+        <w:t xml:space="preserve"> repository.</w:t>
       </w:r>
     </w:p>
     <w:p>
@@ -3478,7 +3717,6 @@
   <w:style w:type="character" w:default="1" w:styleId="DefaultParagraphFont">
     <w:name w:val="Default Paragraph Font"/>
     <w:uiPriority w:val="1"/>
-    <w:semiHidden/>
     <w:unhideWhenUsed/>
   </w:style>
   <w:style w:type="table" w:default="1" w:styleId="TableNormal">

</xml_diff>